<commit_message>
docs: documentacion profesional APA7 SaborExpress ficha 3145555
</commit_message>
<xml_diff>
--- a/1-project-charter/SaborExpress_Acta_Constitucion.docx
+++ b/1-project-charter/SaborExpress_Acta_Constitucion.docx
@@ -4,21 +4,75 @@
   <w:body>
     <w:p>
       <w:pPr>
-        <w:spacing w:before="3100" w:line="480" w:lineRule="auto"/>
+        <w:spacing w:before="1100"/>
+        <w:jc w:val="center"/>
+      </w:pPr>
+      <w:r>
+        <w:drawing>
+          <wp:inline>
+            <wp:extent cx="4389120" cy="2501042"/>
+            <wp:docPr id="39" name="Picture 39"/>
+            <wp:cNvGraphicFramePr>
+              <a:graphicFrameLocks noChangeAspect="1"/>
+            </wp:cNvGraphicFramePr>
+            <a:graphic>
+              <a:graphicData uri="http://schemas.openxmlformats.org/drawingml/2006/picture">
+                <pic:pic>
+                  <pic:nvPicPr>
+                    <pic:cNvPr id="0" name="SaborExpress_logo_transparente.png"/>
+                    <pic:cNvPicPr/>
+                  </pic:nvPicPr>
+                  <pic:blipFill>
+                    <a:blip r:embed="rId9"/>
+                    <a:stretch>
+                      <a:fillRect/>
+                    </a:stretch>
+                  </pic:blipFill>
+                  <pic:spPr>
+                    <a:xfrm>
+                      <a:off x="0" y="0"/>
+                      <a:ext cx="4389120" cy="2501042"/>
+                    </a:xfrm>
+                    <a:prstGeom prst="rect"/>
+                  </pic:spPr>
+                </pic:pic>
+              </a:graphicData>
+            </a:graphic>
+          </wp:inline>
+        </w:drawing>
+      </w:r>
+    </w:p>
+    <w:p>
+      <w:pPr>
+        <w:spacing w:before="900" w:after="500"/>
         <w:jc w:val="center"/>
       </w:pPr>
       <w:r>
         <w:rPr>
           <w:rFonts w:ascii="Times New Roman" w:hAnsi="Times New Roman"/>
           <w:b/>
-          <w:sz w:val="28"/>
+          <w:sz w:val="34"/>
         </w:rPr>
         <w:t>00 Acta constitucion SaborExpress</w:t>
       </w:r>
     </w:p>
     <w:p>
       <w:pPr>
-        <w:spacing w:line="480" w:lineRule="auto"/>
+        <w:spacing w:after="160"/>
+        <w:jc w:val="center"/>
+      </w:pPr>
+      <w:r>
+        <w:rPr>
+          <w:rFonts w:ascii="Times New Roman" w:hAnsi="Times New Roman"/>
+          <w:b/>
+          <w:sz w:val="24"/>
+        </w:rPr>
+        <w:t>SABOREXPRESS — PROYECTO DE SOFTWARE</w:t>
+      </w:r>
+    </w:p>
+    <w:p>
+      <w:pPr>
+        <w:spacing w:after="160"/>
         <w:jc w:val="center"/>
       </w:pPr>
       <w:r>
@@ -26,12 +80,12 @@
           <w:rFonts w:ascii="Times New Roman" w:hAnsi="Times New Roman"/>
           <w:sz w:val="24"/>
         </w:rPr>
-        <w:t>Equipo de desarrollo SaborExpress</w:t>
-      </w:r>
-    </w:p>
-    <w:p>
-      <w:pPr>
-        <w:spacing w:line="480" w:lineRule="auto"/>
+        <w:t>Yerson Stiven Cuellar Rubiano</w:t>
+      </w:r>
+    </w:p>
+    <w:p>
+      <w:pPr>
+        <w:spacing w:after="160"/>
         <w:jc w:val="center"/>
       </w:pPr>
       <w:r>
@@ -39,12 +93,12 @@
           <w:rFonts w:ascii="Times New Roman" w:hAnsi="Times New Roman"/>
           <w:sz w:val="24"/>
         </w:rPr>
-        <w:t>Filiación institucional y autores individuales: por confirmar</w:t>
-      </w:r>
-    </w:p>
-    <w:p>
-      <w:pPr>
-        <w:spacing w:line="480" w:lineRule="auto"/>
+        <w:t>Ficha de formación: 3145555</w:t>
+      </w:r>
+    </w:p>
+    <w:p>
+      <w:pPr>
+        <w:spacing w:after="160"/>
         <w:jc w:val="center"/>
       </w:pPr>
       <w:r>
@@ -52,12 +106,12 @@
           <w:rFonts w:ascii="Times New Roman" w:hAnsi="Times New Roman"/>
           <w:sz w:val="24"/>
         </w:rPr>
-        <w:t>Estudio académico de ingeniería de software y documentación</w:t>
-      </w:r>
-    </w:p>
-    <w:p>
-      <w:pPr>
-        <w:spacing w:line="480" w:lineRule="auto"/>
+        <w:t>Expediente técnico y académico — APA 7</w:t>
+      </w:r>
+    </w:p>
+    <w:p>
+      <w:pPr>
+        <w:spacing w:after="160"/>
         <w:jc w:val="center"/>
       </w:pPr>
       <w:r>
@@ -69,29 +123,39 @@
       </w:r>
     </w:p>
     <w:p>
+      <w:pPr>
+        <w:spacing w:before="600"/>
+        <w:jc w:val="center"/>
+      </w:pPr>
+      <w:r>
+        <w:rPr>
+          <w:i/>
+        </w:rPr>
+        <w:t>Fuente documental: repositorios SaborExpressBack, SaborExpressWeb y SaborExpressMovil.</w:t>
+        <w:br/>
+        <w:t>Las pruebas no ejecutadas se identifican como pendientes.</w:t>
+      </w:r>
+    </w:p>
+    <w:p>
       <w:r>
         <w:br w:type="page"/>
       </w:r>
     </w:p>
-    <w:bookmarkStart w:id="35" w:name="X443a65a380df63760d2aa8db0e0ee5f6d1cffe2"/>
+    <w:bookmarkStart w:id="40" w:name="X443a65a380df63760d2aa8db0e0ee5f6d1cffe2"/>
     <w:p>
       <w:pPr>
         <w:pStyle w:val="Heading1"/>
         <w:keepNext/>
-        <w:ind w:firstLine="0"/>
-      </w:pPr>
-      <w:r>
-        <w:rPr>
-          <w:color w:val="000000"/>
-        </w:rPr>
+        <w:spacing w:line="264" w:lineRule="auto"/>
+      </w:pPr>
+      <w:r>
         <w:t xml:space="preserve">Acta de constitución y alcance del proyecto</w:t>
       </w:r>
     </w:p>
     <w:p>
       <w:pPr>
         <w:pStyle w:val="FirstParagraph"/>
-        <w:spacing w:line="480" w:lineRule="auto" w:after="0"/>
-        <w:ind w:firstLine="720"/>
+        <w:spacing w:line="396" w:lineRule="auto" w:after="100"/>
       </w:pPr>
       <w:r>
         <w:rPr>
@@ -114,13 +178,13 @@
           <w:b/>
           <w:bCs/>
         </w:rPr>
-        <w:t xml:space="preserve">Fecha de corte:</w:t>
-      </w:r>
-      <w:r>
-        <w:t xml:space="preserve"> </w:t>
-      </w:r>
-      <w:r>
-        <w:t xml:space="preserve">14 de octubre de 2026 |</w:t>
+        <w:t xml:space="preserve">Autor / integrante:</w:t>
+      </w:r>
+      <w:r>
+        <w:t xml:space="preserve"> </w:t>
+      </w:r>
+      <w:r>
+        <w:t xml:space="preserve">Yerson Stiven Cuellar Rubiano |</w:t>
       </w:r>
       <w:r>
         <w:t xml:space="preserve"> </w:t>
@@ -130,13 +194,13 @@
           <w:b/>
           <w:bCs/>
         </w:rPr>
-        <w:t xml:space="preserve">Versión:</w:t>
-      </w:r>
-      <w:r>
-        <w:t xml:space="preserve"> </w:t>
-      </w:r>
-      <w:r>
-        <w:t xml:space="preserve">2.0 |</w:t>
+        <w:t xml:space="preserve">Ficha:</w:t>
+      </w:r>
+      <w:r>
+        <w:t xml:space="preserve"> </w:t>
+      </w:r>
+      <w:r>
+        <w:t xml:space="preserve">3145555 |</w:t>
       </w:r>
       <w:r>
         <w:t xml:space="preserve"> </w:t>
@@ -146,26 +210,41 @@
           <w:b/>
           <w:bCs/>
         </w:rPr>
-        <w:t xml:space="preserve">Tipo:</w:t>
-      </w:r>
-      <w:r>
-        <w:t xml:space="preserve"> </w:t>
-      </w:r>
-      <w:r>
-        <w:t xml:space="preserve">Documento técnico y académico</w:t>
-      </w:r>
-    </w:p>
-    <w:p>
-      <w:pPr>
-        <w:pStyle w:val="BodyText"/>
-        <w:spacing w:line="480" w:lineRule="auto" w:after="0"/>
-        <w:ind w:firstLine="720"/>
-      </w:pPr>
+        <w:t xml:space="preserve">Fecha:</w:t>
+      </w:r>
+      <w:r>
+        <w:t xml:space="preserve"> </w:t>
+      </w:r>
+      <w:r>
+        <w:t xml:space="preserve">14 de octubre de 2026 |</w:t>
+      </w:r>
+      <w:r>
+        <w:t xml:space="preserve"> </w:t>
+      </w:r>
       <w:r>
         <w:rPr>
           <w:b/>
           <w:bCs/>
         </w:rPr>
+        <w:t xml:space="preserve">Versión documental:</w:t>
+      </w:r>
+      <w:r>
+        <w:t xml:space="preserve"> </w:t>
+      </w:r>
+      <w:r>
+        <w:t xml:space="preserve">4.0</w:t>
+      </w:r>
+    </w:p>
+    <w:p>
+      <w:pPr>
+        <w:pStyle w:val="BodyText"/>
+        <w:spacing w:line="396" w:lineRule="auto" w:after="100"/>
+      </w:pPr>
+      <w:r>
+        <w:rPr>
+          <w:b/>
+          <w:bCs/>
+        </w:rPr>
         <w:t xml:space="preserve">Estado de la evidencia:</w:t>
       </w:r>
       <w:r>
@@ -180,20 +259,16 @@
       <w:pPr>
         <w:pStyle w:val="Heading2"/>
         <w:keepNext/>
-        <w:ind w:firstLine="0"/>
-      </w:pPr>
-      <w:r>
-        <w:rPr>
-          <w:color w:val="000000"/>
-        </w:rPr>
+        <w:spacing w:line="264" w:lineRule="auto"/>
+      </w:pPr>
+      <w:r>
         <w:t xml:space="preserve">1. Identificación</w:t>
       </w:r>
     </w:p>
     <w:p>
       <w:pPr>
         <w:pStyle w:val="FirstParagraph"/>
-        <w:spacing w:line="480" w:lineRule="auto" w:after="0"/>
-        <w:ind w:firstLine="720"/>
+        <w:spacing w:line="396" w:lineRule="auto" w:after="100"/>
       </w:pPr>
       <w:r>
         <w:rPr>
@@ -247,20 +322,16 @@
       <w:pPr>
         <w:pStyle w:val="Heading2"/>
         <w:keepNext/>
-        <w:ind w:firstLine="0"/>
-      </w:pPr>
-      <w:r>
-        <w:rPr>
-          <w:color w:val="000000"/>
-        </w:rPr>
+        <w:spacing w:line="264" w:lineRule="auto"/>
+      </w:pPr>
+      <w:r>
         <w:t xml:space="preserve">2. Justificación</w:t>
       </w:r>
     </w:p>
     <w:p>
       <w:pPr>
         <w:pStyle w:val="FirstParagraph"/>
-        <w:spacing w:line="480" w:lineRule="auto" w:after="0"/>
-        <w:ind w:firstLine="720"/>
+        <w:spacing w:line="396" w:lineRule="auto" w:after="100"/>
       </w:pPr>
       <w:r>
         <w:t xml:space="preserve">La coordinación digital de catálogo, atención de mesa, preparación, pagos y domicilios puede mejorar trazabilidad operativa. El beneficio medible aún debe comprobarse en un piloto; aquí se registra una solución de ingeniería y su alcance técnico verificable.</w:t>
@@ -272,20 +343,16 @@
       <w:pPr>
         <w:pStyle w:val="Heading2"/>
         <w:keepNext/>
-        <w:ind w:firstLine="0"/>
-      </w:pPr>
-      <w:r>
-        <w:rPr>
-          <w:color w:val="000000"/>
-        </w:rPr>
+        <w:spacing w:line="264" w:lineRule="auto"/>
+      </w:pPr>
+      <w:r>
         <w:t xml:space="preserve">3. Objetivo general</w:t>
       </w:r>
     </w:p>
     <w:p>
       <w:pPr>
         <w:pStyle w:val="FirstParagraph"/>
-        <w:spacing w:line="480" w:lineRule="auto" w:after="0"/>
-        <w:ind w:firstLine="720"/>
+        <w:spacing w:line="396" w:lineRule="auto" w:after="100"/>
       </w:pPr>
       <w:r>
         <w:t xml:space="preserve">Analizar, documentar y validar una plataforma digital integrada para gestionar operaciones de restaurantes mediante API REST modular, portal web y aplicación móvil.</w:t>
@@ -297,20 +364,16 @@
       <w:pPr>
         <w:pStyle w:val="Heading2"/>
         <w:keepNext/>
-        <w:ind w:firstLine="0"/>
-      </w:pPr>
-      <w:r>
-        <w:rPr>
-          <w:color w:val="000000"/>
-        </w:rPr>
+        <w:spacing w:line="264" w:lineRule="auto"/>
+      </w:pPr>
+      <w:r>
         <w:t xml:space="preserve">4. Alcance incluido y excluido</w:t>
       </w:r>
     </w:p>
     <w:p>
       <w:pPr>
         <w:pStyle w:val="FirstParagraph"/>
-        <w:spacing w:line="480" w:lineRule="auto" w:after="0"/>
-        <w:ind w:firstLine="720"/>
+        <w:spacing w:line="396" w:lineRule="auto" w:after="100"/>
       </w:pPr>
       <w:r>
         <w:t xml:space="preserve">Incluye gestión de usuarios/roles, sedes, personal, catálogo, pedidos, pagos, reparto, notificaciones y configuraciones observadas en código. Excluye: prueba de operación real a escala, seguridad certificada, condiciones contractuales de Wompi, costos finalizados, mercadeo y flota física.</w:t>
@@ -322,20 +385,16 @@
       <w:pPr>
         <w:pStyle w:val="Heading2"/>
         <w:keepNext/>
-        <w:ind w:firstLine="0"/>
-      </w:pPr>
-      <w:r>
-        <w:rPr>
-          <w:color w:val="000000"/>
-        </w:rPr>
+        <w:spacing w:line="264" w:lineRule="auto"/>
+      </w:pPr>
+      <w:r>
         <w:t xml:space="preserve">5. Entregables</w:t>
       </w:r>
     </w:p>
     <w:p>
       <w:pPr>
         <w:pStyle w:val="FirstParagraph"/>
-        <w:spacing w:line="480" w:lineRule="auto" w:after="0"/>
-        <w:ind w:firstLine="720"/>
+        <w:spacing w:line="396" w:lineRule="auto" w:after="100"/>
       </w:pPr>
       <w:r>
         <w:t xml:space="preserve">SRS, análisis, propuesta, diseño, datos, catálogo API/Postman, instalación, manuales, plan de pruebas, matriz de trazabilidad, correctivos, informe de cierre y artículos académicos.</w:t>
@@ -347,20 +406,16 @@
       <w:pPr>
         <w:pStyle w:val="Heading2"/>
         <w:keepNext/>
-        <w:ind w:firstLine="0"/>
-      </w:pPr>
-      <w:r>
-        <w:rPr>
-          <w:color w:val="000000"/>
-        </w:rPr>
+        <w:spacing w:line="264" w:lineRule="auto"/>
+      </w:pPr>
+      <w:r>
         <w:t xml:space="preserve">6. Interesados, cronograma y riesgos</w:t>
       </w:r>
     </w:p>
     <w:p>
       <w:pPr>
         <w:pStyle w:val="FirstParagraph"/>
-        <w:spacing w:line="480" w:lineRule="auto" w:after="0"/>
-        <w:ind w:firstLine="720"/>
+        <w:spacing w:line="396" w:lineRule="auto" w:after="100"/>
       </w:pPr>
       <w:r>
         <w:t xml:space="preserve">Los roles de responsabilidad se definirán en acta aprobada. Cronograma relativo P1–P6 según propuesta técnica, sin fechas comprometidas. Riesgos principales: autorización intersede, cobros, migraciones, disponibilidad, datos personales, ausencia de pruebas reproducibles.</w:t>
@@ -372,20 +427,16 @@
       <w:pPr>
         <w:pStyle w:val="Heading2"/>
         <w:keepNext/>
-        <w:ind w:firstLine="0"/>
-      </w:pPr>
-      <w:r>
-        <w:rPr>
-          <w:color w:val="000000"/>
-        </w:rPr>
+        <w:spacing w:line="264" w:lineRule="auto"/>
+      </w:pPr>
+      <w:r>
         <w:t xml:space="preserve">7. Criterios de aprobación</w:t>
       </w:r>
     </w:p>
     <w:p>
       <w:pPr>
         <w:pStyle w:val="FirstParagraph"/>
-        <w:spacing w:line="480" w:lineRule="auto" w:after="0"/>
-        <w:ind w:firstLine="720"/>
+        <w:spacing w:line="396" w:lineRule="auto" w:after="100"/>
       </w:pPr>
       <w:r>
         <w:t xml:space="preserve">La documentación se considera entregable para</w:t>
@@ -410,12 +461,9 @@
       <w:pPr>
         <w:pStyle w:val="Heading2"/>
         <w:keepNext/>
-        <w:ind w:firstLine="0"/>
-      </w:pPr>
-      <w:r>
-        <w:rPr>
-          <w:color w:val="000000"/>
-        </w:rPr>
+        <w:spacing w:line="264" w:lineRule="auto"/>
+      </w:pPr>
+      <w:r>
         <w:t xml:space="preserve">8. Línea base de alcance, gobernanza y entregables</w:t>
       </w:r>
     </w:p>
@@ -424,7 +472,7 @@
         <w:tblStyle w:val="Table"/>
         <w:tblW w:type="pct" w:w="5000"/>
         <w:jc w:val="left"/>
-        <w:tblLayout w:type="fixed"/>
+        <w:tblLayout w:type="autofit"/>
         <w:tblLook w:firstRow="1" w:lastRow="0" w:firstColumn="0" w:lastColumn="0" w:noHBand="0" w:noVBand="0" w:val="0020"/>
       </w:tblPr>
       <w:tblGrid>
@@ -442,14 +490,14 @@
           <w:p>
             <w:pPr>
               <w:pStyle w:val="Compact"/>
-              <w:spacing w:line="240" w:lineRule="auto" w:after="0"/>
-              <w:ind w:firstLine="0"/>
-              <w:jc w:val="left"/>
-            </w:pPr>
-            <w:r>
-              <w:rPr>
-                <w:rFonts w:ascii="Times New Roman" w:hAnsi="Times New Roman"/>
-                <w:sz w:val="18"/>
+              <w:spacing w:line="240" w:lineRule="auto" w:after="20"/>
+              <w:ind w:firstLine="0"/>
+              <w:jc w:val="left"/>
+            </w:pPr>
+            <w:r>
+              <w:rPr>
+                <w:b/>
+                <w:sz w:val="17"/>
               </w:rPr>
               <w:t xml:space="preserve">Elemento</w:t>
             </w:r>
@@ -460,14 +508,14 @@
           <w:p>
             <w:pPr>
               <w:pStyle w:val="Compact"/>
-              <w:spacing w:line="240" w:lineRule="auto" w:after="0"/>
-              <w:ind w:firstLine="0"/>
-              <w:jc w:val="left"/>
-            </w:pPr>
-            <w:r>
-              <w:rPr>
-                <w:rFonts w:ascii="Times New Roman" w:hAnsi="Times New Roman"/>
-                <w:sz w:val="18"/>
+              <w:spacing w:line="240" w:lineRule="auto" w:after="20"/>
+              <w:ind w:firstLine="0"/>
+              <w:jc w:val="left"/>
+            </w:pPr>
+            <w:r>
+              <w:rPr>
+                <w:b/>
+                <w:sz w:val="17"/>
               </w:rPr>
               <w:t xml:space="preserve">Alcance detallado</w:t>
             </w:r>
@@ -478,14 +526,14 @@
           <w:p>
             <w:pPr>
               <w:pStyle w:val="Compact"/>
-              <w:spacing w:line="240" w:lineRule="auto" w:after="0"/>
-              <w:ind w:firstLine="0"/>
-              <w:jc w:val="left"/>
-            </w:pPr>
-            <w:r>
-              <w:rPr>
-                <w:rFonts w:ascii="Times New Roman" w:hAnsi="Times New Roman"/>
-                <w:sz w:val="18"/>
+              <w:spacing w:line="240" w:lineRule="auto" w:after="20"/>
+              <w:ind w:firstLine="0"/>
+              <w:jc w:val="left"/>
+            </w:pPr>
+            <w:r>
+              <w:rPr>
+                <w:b/>
+                <w:sz w:val="17"/>
               </w:rPr>
               <w:t xml:space="preserve">No se afirma</w:t>
             </w:r>
@@ -498,14 +546,13 @@
           <w:p>
             <w:pPr>
               <w:pStyle w:val="Compact"/>
-              <w:spacing w:line="240" w:lineRule="auto" w:after="0"/>
-              <w:ind w:firstLine="0"/>
-              <w:jc w:val="left"/>
-            </w:pPr>
-            <w:r>
-              <w:rPr>
-                <w:rFonts w:ascii="Times New Roman" w:hAnsi="Times New Roman"/>
-                <w:sz w:val="18"/>
+              <w:spacing w:line="240" w:lineRule="auto" w:after="20"/>
+              <w:ind w:firstLine="0"/>
+              <w:jc w:val="left"/>
+            </w:pPr>
+            <w:r>
+              <w:rPr>
+                <w:sz w:val="17"/>
               </w:rPr>
               <w:t xml:space="preserve">Producto</w:t>
             </w:r>
@@ -516,14 +563,13 @@
           <w:p>
             <w:pPr>
               <w:pStyle w:val="Compact"/>
-              <w:spacing w:line="240" w:lineRule="auto" w:after="0"/>
-              <w:ind w:firstLine="0"/>
-              <w:jc w:val="left"/>
-            </w:pPr>
-            <w:r>
-              <w:rPr>
-                <w:rFonts w:ascii="Times New Roman" w:hAnsi="Times New Roman"/>
-                <w:sz w:val="18"/>
+              <w:spacing w:line="240" w:lineRule="auto" w:after="20"/>
+              <w:ind w:firstLine="0"/>
+              <w:jc w:val="left"/>
+            </w:pPr>
+            <w:r>
+              <w:rPr>
+                <w:sz w:val="17"/>
               </w:rPr>
               <w:t xml:space="preserve">API REST de restaurante + clientes web y móvil</w:t>
             </w:r>
@@ -534,14 +580,13 @@
           <w:p>
             <w:pPr>
               <w:pStyle w:val="Compact"/>
-              <w:spacing w:line="240" w:lineRule="auto" w:after="0"/>
-              <w:ind w:firstLine="0"/>
-              <w:jc w:val="left"/>
-            </w:pPr>
-            <w:r>
-              <w:rPr>
-                <w:rFonts w:ascii="Times New Roman" w:hAnsi="Times New Roman"/>
-                <w:sz w:val="18"/>
+              <w:spacing w:line="240" w:lineRule="auto" w:after="20"/>
+              <w:ind w:firstLine="0"/>
+              <w:jc w:val="left"/>
+            </w:pPr>
+            <w:r>
+              <w:rPr>
+                <w:sz w:val="17"/>
               </w:rPr>
               <w:t xml:space="preserve">que sea microservicio o producción</w:t>
             </w:r>
@@ -554,14 +599,13 @@
           <w:p>
             <w:pPr>
               <w:pStyle w:val="Compact"/>
-              <w:spacing w:line="240" w:lineRule="auto" w:after="0"/>
-              <w:ind w:firstLine="0"/>
-              <w:jc w:val="left"/>
-            </w:pPr>
-            <w:r>
-              <w:rPr>
-                <w:rFonts w:ascii="Times New Roman" w:hAnsi="Times New Roman"/>
-                <w:sz w:val="18"/>
+              <w:spacing w:line="240" w:lineRule="auto" w:after="20"/>
+              <w:ind w:firstLine="0"/>
+              <w:jc w:val="left"/>
+            </w:pPr>
+            <w:r>
+              <w:rPr>
+                <w:sz w:val="17"/>
               </w:rPr>
               <w:t xml:space="preserve">Usuarios</w:t>
             </w:r>
@@ -572,14 +616,13 @@
           <w:p>
             <w:pPr>
               <w:pStyle w:val="Compact"/>
-              <w:spacing w:line="240" w:lineRule="auto" w:after="0"/>
-              <w:ind w:firstLine="0"/>
-              <w:jc w:val="left"/>
-            </w:pPr>
-            <w:r>
-              <w:rPr>
-                <w:rFonts w:ascii="Times New Roman" w:hAnsi="Times New Roman"/>
-                <w:sz w:val="18"/>
+              <w:spacing w:line="240" w:lineRule="auto" w:after="20"/>
+              <w:ind w:firstLine="0"/>
+              <w:jc w:val="left"/>
+            </w:pPr>
+            <w:r>
+              <w:rPr>
+                <w:sz w:val="17"/>
               </w:rPr>
               <w:t xml:space="preserve">cliente, caja, cocina, reparto, gerencia y administración</w:t>
             </w:r>
@@ -590,14 +633,13 @@
           <w:p>
             <w:pPr>
               <w:pStyle w:val="Compact"/>
-              <w:spacing w:line="240" w:lineRule="auto" w:after="0"/>
-              <w:ind w:firstLine="0"/>
-              <w:jc w:val="left"/>
-            </w:pPr>
-            <w:r>
-              <w:rPr>
-                <w:rFonts w:ascii="Times New Roman" w:hAnsi="Times New Roman"/>
-                <w:sz w:val="18"/>
+              <w:spacing w:line="240" w:lineRule="auto" w:after="20"/>
+              <w:ind w:firstLine="0"/>
+              <w:jc w:val="left"/>
+            </w:pPr>
+            <w:r>
+              <w:rPr>
+                <w:sz w:val="17"/>
               </w:rPr>
               <w:t xml:space="preserve">piloto con usuarios realizado</w:t>
             </w:r>
@@ -610,14 +652,13 @@
           <w:p>
             <w:pPr>
               <w:pStyle w:val="Compact"/>
-              <w:spacing w:line="240" w:lineRule="auto" w:after="0"/>
-              <w:ind w:firstLine="0"/>
-              <w:jc w:val="left"/>
-            </w:pPr>
-            <w:r>
-              <w:rPr>
-                <w:rFonts w:ascii="Times New Roman" w:hAnsi="Times New Roman"/>
-                <w:sz w:val="18"/>
+              <w:spacing w:line="240" w:lineRule="auto" w:after="20"/>
+              <w:ind w:firstLine="0"/>
+              <w:jc w:val="left"/>
+            </w:pPr>
+            <w:r>
+              <w:rPr>
+                <w:sz w:val="17"/>
               </w:rPr>
               <w:t xml:space="preserve">Funcional</w:t>
             </w:r>
@@ -628,14 +669,13 @@
           <w:p>
             <w:pPr>
               <w:pStyle w:val="Compact"/>
-              <w:spacing w:line="240" w:lineRule="auto" w:after="0"/>
-              <w:ind w:firstLine="0"/>
-              <w:jc w:val="left"/>
-            </w:pPr>
-            <w:r>
-              <w:rPr>
-                <w:rFonts w:ascii="Times New Roman" w:hAnsi="Times New Roman"/>
-                <w:sz w:val="18"/>
+              <w:spacing w:line="240" w:lineRule="auto" w:after="20"/>
+              <w:ind w:firstLine="0"/>
+              <w:jc w:val="left"/>
+            </w:pPr>
+            <w:r>
+              <w:rPr>
+                <w:sz w:val="17"/>
               </w:rPr>
               <w:t xml:space="preserve">pedidos, pagos, sedes, catálogo, personal, entregas</w:t>
             </w:r>
@@ -646,14 +686,13 @@
           <w:p>
             <w:pPr>
               <w:pStyle w:val="Compact"/>
-              <w:spacing w:line="240" w:lineRule="auto" w:after="0"/>
-              <w:ind w:firstLine="0"/>
-              <w:jc w:val="left"/>
-            </w:pPr>
-            <w:r>
-              <w:rPr>
-                <w:rFonts w:ascii="Times New Roman" w:hAnsi="Times New Roman"/>
-                <w:sz w:val="18"/>
+              <w:spacing w:line="240" w:lineRule="auto" w:after="20"/>
+              <w:ind w:firstLine="0"/>
+              <w:jc w:val="left"/>
+            </w:pPr>
+            <w:r>
+              <w:rPr>
+                <w:sz w:val="17"/>
               </w:rPr>
               <w:t xml:space="preserve">todos los módulos aceptados</w:t>
             </w:r>
@@ -666,14 +705,13 @@
           <w:p>
             <w:pPr>
               <w:pStyle w:val="Compact"/>
-              <w:spacing w:line="240" w:lineRule="auto" w:after="0"/>
-              <w:ind w:firstLine="0"/>
-              <w:jc w:val="left"/>
-            </w:pPr>
-            <w:r>
-              <w:rPr>
-                <w:rFonts w:ascii="Times New Roman" w:hAnsi="Times New Roman"/>
-                <w:sz w:val="18"/>
+              <w:spacing w:line="240" w:lineRule="auto" w:after="20"/>
+              <w:ind w:firstLine="0"/>
+              <w:jc w:val="left"/>
+            </w:pPr>
+            <w:r>
+              <w:rPr>
+                <w:sz w:val="17"/>
               </w:rPr>
               <w:t xml:space="preserve">Documental</w:t>
             </w:r>
@@ -684,14 +722,13 @@
           <w:p>
             <w:pPr>
               <w:pStyle w:val="Compact"/>
-              <w:spacing w:line="240" w:lineRule="auto" w:after="0"/>
-              <w:ind w:firstLine="0"/>
-              <w:jc w:val="left"/>
-            </w:pPr>
-            <w:r>
-              <w:rPr>
-                <w:rFonts w:ascii="Times New Roman" w:hAnsi="Times New Roman"/>
-                <w:sz w:val="18"/>
+              <w:spacing w:line="240" w:lineRule="auto" w:after="20"/>
+              <w:ind w:firstLine="0"/>
+              <w:jc w:val="left"/>
+            </w:pPr>
+            <w:r>
+              <w:rPr>
+                <w:sz w:val="17"/>
               </w:rPr>
               <w:t xml:space="preserve">SRS, SDD, plan QA, manuales y artículo científico</w:t>
             </w:r>
@@ -702,14 +739,13 @@
           <w:p>
             <w:pPr>
               <w:pStyle w:val="Compact"/>
-              <w:spacing w:line="240" w:lineRule="auto" w:after="0"/>
-              <w:ind w:firstLine="0"/>
-              <w:jc w:val="left"/>
-            </w:pPr>
-            <w:r>
-              <w:rPr>
-                <w:rFonts w:ascii="Times New Roman" w:hAnsi="Times New Roman"/>
-                <w:sz w:val="18"/>
+              <w:spacing w:line="240" w:lineRule="auto" w:after="20"/>
+              <w:ind w:firstLine="0"/>
+              <w:jc w:val="left"/>
+            </w:pPr>
+            <w:r>
+              <w:rPr>
+                <w:sz w:val="17"/>
               </w:rPr>
               <w:t xml:space="preserve">aprobación institucional</w:t>
             </w:r>
@@ -722,14 +758,13 @@
           <w:p>
             <w:pPr>
               <w:pStyle w:val="Compact"/>
-              <w:spacing w:line="240" w:lineRule="auto" w:after="0"/>
-              <w:ind w:firstLine="0"/>
-              <w:jc w:val="left"/>
-            </w:pPr>
-            <w:r>
-              <w:rPr>
-                <w:rFonts w:ascii="Times New Roman" w:hAnsi="Times New Roman"/>
-                <w:sz w:val="18"/>
+              <w:spacing w:line="240" w:lineRule="auto" w:after="20"/>
+              <w:ind w:firstLine="0"/>
+              <w:jc w:val="left"/>
+            </w:pPr>
+            <w:r>
+              <w:rPr>
+                <w:sz w:val="17"/>
               </w:rPr>
               <w:t xml:space="preserve">Plataforma</w:t>
             </w:r>
@@ -740,14 +775,13 @@
           <w:p>
             <w:pPr>
               <w:pStyle w:val="Compact"/>
-              <w:spacing w:line="240" w:lineRule="auto" w:after="0"/>
-              <w:ind w:firstLine="0"/>
-              <w:jc w:val="left"/>
-            </w:pPr>
-            <w:r>
-              <w:rPr>
-                <w:rFonts w:ascii="Times New Roman" w:hAnsi="Times New Roman"/>
-                <w:sz w:val="18"/>
+              <w:spacing w:line="240" w:lineRule="auto" w:after="20"/>
+              <w:ind w:firstLine="0"/>
+              <w:jc w:val="left"/>
+            </w:pPr>
+            <w:r>
+              <w:rPr>
+                <w:sz w:val="17"/>
               </w:rPr>
               <w:t xml:space="preserve">ASP.NET Core 8, Next.js 16, Expo 57</w:t>
             </w:r>
@@ -758,14 +792,13 @@
           <w:p>
             <w:pPr>
               <w:pStyle w:val="Compact"/>
-              <w:spacing w:line="240" w:lineRule="auto" w:after="0"/>
-              <w:ind w:firstLine="0"/>
-              <w:jc w:val="left"/>
-            </w:pPr>
-            <w:r>
-              <w:rPr>
-                <w:rFonts w:ascii="Times New Roman" w:hAnsi="Times New Roman"/>
-                <w:sz w:val="18"/>
+              <w:spacing w:line="240" w:lineRule="auto" w:after="20"/>
+              <w:ind w:firstLine="0"/>
+              <w:jc w:val="left"/>
+            </w:pPr>
+            <w:r>
+              <w:rPr>
+                <w:sz w:val="17"/>
               </w:rPr>
               <w:t xml:space="preserve">calidad del despliegue real</w:t>
             </w:r>
@@ -778,14 +811,13 @@
           <w:p>
             <w:pPr>
               <w:pStyle w:val="Compact"/>
-              <w:spacing w:line="240" w:lineRule="auto" w:after="0"/>
-              <w:ind w:firstLine="0"/>
-              <w:jc w:val="left"/>
-            </w:pPr>
-            <w:r>
-              <w:rPr>
-                <w:rFonts w:ascii="Times New Roman" w:hAnsi="Times New Roman"/>
-                <w:sz w:val="18"/>
+              <w:spacing w:line="240" w:lineRule="auto" w:after="20"/>
+              <w:ind w:firstLine="0"/>
+              <w:jc w:val="left"/>
+            </w:pPr>
+            <w:r>
+              <w:rPr>
+                <w:sz w:val="17"/>
               </w:rPr>
               <w:t xml:space="preserve">Investigación</w:t>
             </w:r>
@@ -796,14 +828,13 @@
           <w:p>
             <w:pPr>
               <w:pStyle w:val="Compact"/>
-              <w:spacing w:line="240" w:lineRule="auto" w:after="0"/>
-              <w:ind w:firstLine="0"/>
-              <w:jc w:val="left"/>
-            </w:pPr>
-            <w:r>
-              <w:rPr>
-                <w:rFonts w:ascii="Times New Roman" w:hAnsi="Times New Roman"/>
-                <w:sz w:val="18"/>
+              <w:spacing w:line="240" w:lineRule="auto" w:after="20"/>
+              <w:ind w:firstLine="0"/>
+              <w:jc w:val="left"/>
+            </w:pPr>
+            <w:r>
+              <w:rPr>
+                <w:sz w:val="17"/>
               </w:rPr>
               <w:t xml:space="preserve">estudio de caso documental y bibliografía dirigida</w:t>
             </w:r>
@@ -814,14 +845,13 @@
           <w:p>
             <w:pPr>
               <w:pStyle w:val="Compact"/>
-              <w:spacing w:line="240" w:lineRule="auto" w:after="0"/>
-              <w:ind w:firstLine="0"/>
-              <w:jc w:val="left"/>
-            </w:pPr>
-            <w:r>
-              <w:rPr>
-                <w:rFonts w:ascii="Times New Roman" w:hAnsi="Times New Roman"/>
-                <w:sz w:val="18"/>
+              <w:spacing w:line="240" w:lineRule="auto" w:after="20"/>
+              <w:ind w:firstLine="0"/>
+              <w:jc w:val="left"/>
+            </w:pPr>
+            <w:r>
+              <w:rPr>
+                <w:sz w:val="17"/>
               </w:rPr>
               <w:t xml:space="preserve">experimentos de campo</w:t>
             </w:r>
@@ -834,14 +864,13 @@
           <w:p>
             <w:pPr>
               <w:pStyle w:val="Compact"/>
-              <w:spacing w:line="240" w:lineRule="auto" w:after="0"/>
-              <w:ind w:firstLine="0"/>
-              <w:jc w:val="left"/>
-            </w:pPr>
-            <w:r>
-              <w:rPr>
-                <w:rFonts w:ascii="Times New Roman" w:hAnsi="Times New Roman"/>
-                <w:sz w:val="18"/>
+              <w:spacing w:line="240" w:lineRule="auto" w:after="20"/>
+              <w:ind w:firstLine="0"/>
+              <w:jc w:val="left"/>
+            </w:pPr>
+            <w:r>
+              <w:rPr>
+                <w:sz w:val="17"/>
               </w:rPr>
               <w:t xml:space="preserve">Ejecución</w:t>
             </w:r>
@@ -852,14 +881,13 @@
           <w:p>
             <w:pPr>
               <w:pStyle w:val="Compact"/>
-              <w:spacing w:line="240" w:lineRule="auto" w:after="0"/>
-              <w:ind w:firstLine="0"/>
-              <w:jc w:val="left"/>
-            </w:pPr>
-            <w:r>
-              <w:rPr>
-                <w:rFonts w:ascii="Times New Roman" w:hAnsi="Times New Roman"/>
-                <w:sz w:val="18"/>
+              <w:spacing w:line="240" w:lineRule="auto" w:after="20"/>
+              <w:ind w:firstLine="0"/>
+              <w:jc w:val="left"/>
+            </w:pPr>
+            <w:r>
+              <w:rPr>
+                <w:sz w:val="17"/>
               </w:rPr>
               <w:t xml:space="preserve">propuesta de fases con hitos verificables</w:t>
             </w:r>
@@ -870,14 +898,13 @@
           <w:p>
             <w:pPr>
               <w:pStyle w:val="Compact"/>
-              <w:spacing w:line="240" w:lineRule="auto" w:after="0"/>
-              <w:ind w:firstLine="0"/>
-              <w:jc w:val="left"/>
-            </w:pPr>
-            <w:r>
-              <w:rPr>
-                <w:rFonts w:ascii="Times New Roman" w:hAnsi="Times New Roman"/>
-                <w:sz w:val="18"/>
+              <w:spacing w:line="240" w:lineRule="auto" w:after="20"/>
+              <w:ind w:firstLine="0"/>
+              <w:jc w:val="left"/>
+            </w:pPr>
+            <w:r>
+              <w:rPr>
+                <w:sz w:val="17"/>
               </w:rPr>
               <w:t xml:space="preserve">fechas, costos y nombres inventados</w:t>
             </w:r>
@@ -891,20 +918,16 @@
       <w:pPr>
         <w:pStyle w:val="Heading2"/>
         <w:keepNext/>
-        <w:ind w:firstLine="0"/>
-      </w:pPr>
-      <w:r>
-        <w:rPr>
-          <w:color w:val="000000"/>
-        </w:rPr>
+        <w:spacing w:line="264" w:lineRule="auto"/>
+      </w:pPr>
+      <w:r>
         <w:t xml:space="preserve">9. Hitos y criterios de decisión</w:t>
       </w:r>
     </w:p>
     <w:p>
       <w:pPr>
         <w:pStyle w:val="FirstParagraph"/>
-        <w:spacing w:line="480" w:lineRule="auto" w:after="0"/>
-        <w:ind w:firstLine="720"/>
+        <w:spacing w:line="396" w:lineRule="auto" w:after="100"/>
       </w:pPr>
       <w:r>
         <w:rPr>
@@ -1003,8 +1026,7 @@
     <w:p>
       <w:pPr>
         <w:pStyle w:val="BodyText"/>
-        <w:spacing w:line="480" w:lineRule="auto" w:after="0"/>
-        <w:ind w:firstLine="720"/>
+        <w:spacing w:line="396" w:lineRule="auto" w:after="100"/>
       </w:pPr>
       <w:r>
         <w:rPr>
@@ -1026,12 +1048,9 @@
       <w:pPr>
         <w:pStyle w:val="Heading2"/>
         <w:keepNext/>
-        <w:ind w:firstLine="0"/>
-      </w:pPr>
-      <w:r>
-        <w:rPr>
-          <w:color w:val="000000"/>
-        </w:rPr>
+        <w:spacing w:line="264" w:lineRule="auto"/>
+      </w:pPr>
+      <w:r>
         <w:t xml:space="preserve">10. Criterios de éxito y límites</w:t>
       </w:r>
     </w:p>
@@ -1042,6 +1061,7 @@
           <w:ilvl w:val="0"/>
           <w:numId w:val="1001"/>
         </w:numPr>
+        <w:spacing w:line="396" w:lineRule="auto" w:after="100"/>
       </w:pPr>
       <w:r>
         <w:t xml:space="preserve">Integridad de pedidos y de pagos respaldada por pruebas.</w:t>
@@ -1054,6 +1074,7 @@
           <w:ilvl w:val="0"/>
           <w:numId w:val="1001"/>
         </w:numPr>
+        <w:spacing w:line="396" w:lineRule="auto" w:after="100"/>
       </w:pPr>
       <w:r>
         <w:t xml:space="preserve">Segregación por rol, cliente y sede probada.</w:t>
@@ -1066,6 +1087,7 @@
           <w:ilvl w:val="0"/>
           <w:numId w:val="1001"/>
         </w:numPr>
+        <w:spacing w:line="396" w:lineRule="auto" w:after="100"/>
       </w:pPr>
       <w:r>
         <w:t xml:space="preserve">Manuales de instalación/operación replicables en equipo limpio.</w:t>
@@ -1078,6 +1100,7 @@
           <w:ilvl w:val="0"/>
           <w:numId w:val="1001"/>
         </w:numPr>
+        <w:spacing w:line="396" w:lineRule="auto" w:after="100"/>
       </w:pPr>
       <w:r>
         <w:t xml:space="preserve">Respaldo y restauración ejecutados.</w:t>
@@ -1090,6 +1113,7 @@
           <w:ilvl w:val="0"/>
           <w:numId w:val="1001"/>
         </w:numPr>
+        <w:spacing w:line="396" w:lineRule="auto" w:after="100"/>
       </w:pPr>
       <w:r>
         <w:t xml:space="preserve">Riesgos críticos controlados y firmados.</w:t>
@@ -1102,6 +1126,7 @@
           <w:ilvl w:val="0"/>
           <w:numId w:val="1001"/>
         </w:numPr>
+        <w:spacing w:line="396" w:lineRule="auto" w:after="100"/>
       </w:pPr>
       <w:r>
         <w:t xml:space="preserve">Métricas de rendimiento y usabilidad definidas antes de medir.</w:t>
@@ -1110,8 +1135,7 @@
     <w:p>
       <w:pPr>
         <w:pStyle w:val="FirstParagraph"/>
-        <w:spacing w:line="480" w:lineRule="auto" w:after="0"/>
-        <w:ind w:firstLine="720"/>
+        <w:spacing w:line="396" w:lineRule="auto" w:after="100"/>
       </w:pPr>
       <w:r>
         <w:t xml:space="preserve">Los anteriores son criterios propuestos, no resultados. Presupuesto total, duración, roles nominativos, establecimiento piloto y propiedad intelectual requieren información aportada por el equipo.</w:t>
@@ -1123,20 +1147,16 @@
       <w:pPr>
         <w:pStyle w:val="Heading2"/>
         <w:keepNext/>
-        <w:ind w:firstLine="0"/>
-      </w:pPr>
-      <w:r>
-        <w:rPr>
-          <w:color w:val="000000"/>
-        </w:rPr>
+        <w:spacing w:line="264" w:lineRule="auto"/>
+      </w:pPr>
+      <w:r>
         <w:t xml:space="preserve">10. Gestión de interesados y comunicación</w:t>
       </w:r>
     </w:p>
     <w:p>
       <w:pPr>
         <w:pStyle w:val="FirstParagraph"/>
-        <w:spacing w:line="480" w:lineRule="auto" w:after="0"/>
-        <w:ind w:firstLine="720"/>
+        <w:spacing w:line="396" w:lineRule="auto" w:after="100"/>
       </w:pPr>
       <w:r>
         <w:t xml:space="preserve">La gobernanza propuesta requiere un patrocinador funcional para validar objetivos, un representante de operación gastronómica que confirme estados y reglas de negocio, un responsable de backend para contratos y datos, responsables de interfaz web y móvil, un equipo de calidad para evidencias y un propietario documental para vigencia de los entregables. No se dispone de designaciones nominales ni firmas; los cargos constituyen roles de proyecto sugeridos.</w:t>
@@ -1145,8 +1165,7 @@
     <w:p>
       <w:pPr>
         <w:pStyle w:val="BodyText"/>
-        <w:spacing w:line="480" w:lineRule="auto" w:after="0"/>
-        <w:ind w:firstLine="720"/>
+        <w:spacing w:line="396" w:lineRule="auto" w:after="100"/>
       </w:pPr>
       <w:r>
         <w:t xml:space="preserve">El equipo celebrará revisión de avance por incremento o entrega funcional, registrará decisiones en acta con ID, contexto, alternativas, decisión, impacto, responsable y fecha, y conservará las aprobaciones dentro de un sistema de control de versiones. Las decisiones con consecuencia financiera, de seguridad o privacidad requieren la revisión simultánea de operaciones, backend y pruebas, incluso si una implementación concreta solo toca una capa.</w:t>
@@ -1157,12 +1176,9 @@
       <w:pPr>
         <w:pStyle w:val="Heading3"/>
         <w:keepNext/>
-        <w:ind w:firstLine="0"/>
-      </w:pPr>
-      <w:r>
-        <w:rPr>
-          <w:color w:val="000000"/>
-        </w:rPr>
+        <w:spacing w:line="264" w:lineRule="auto"/>
+      </w:pPr>
+      <w:r>
         <w:t xml:space="preserve">10.1. Matriz de responsabilidades de referencia</w:t>
       </w:r>
     </w:p>
@@ -1171,7 +1187,7 @@
         <w:tblStyle w:val="Table"/>
         <w:tblW w:type="pct" w:w="5000"/>
         <w:jc w:val="left"/>
-        <w:tblLayout w:type="fixed"/>
+        <w:tblLayout w:type="autofit"/>
         <w:tblLook w:firstRow="1" w:lastRow="0" w:firstColumn="0" w:lastColumn="0" w:noHBand="0" w:noVBand="0" w:val="0020"/>
       </w:tblPr>
       <w:tblGrid>
@@ -1190,14 +1206,14 @@
           <w:p>
             <w:pPr>
               <w:pStyle w:val="Compact"/>
-              <w:spacing w:line="240" w:lineRule="auto" w:after="0"/>
-              <w:ind w:firstLine="0"/>
-              <w:jc w:val="left"/>
-            </w:pPr>
-            <w:r>
-              <w:rPr>
-                <w:rFonts w:ascii="Times New Roman" w:hAnsi="Times New Roman"/>
-                <w:sz w:val="18"/>
+              <w:spacing w:line="240" w:lineRule="auto" w:after="20"/>
+              <w:ind w:firstLine="0"/>
+              <w:jc w:val="left"/>
+            </w:pPr>
+            <w:r>
+              <w:rPr>
+                <w:b/>
+                <w:sz w:val="17"/>
               </w:rPr>
               <w:t xml:space="preserve">Actividad</w:t>
             </w:r>
@@ -1208,14 +1224,14 @@
           <w:p>
             <w:pPr>
               <w:pStyle w:val="Compact"/>
-              <w:spacing w:line="240" w:lineRule="auto" w:after="0"/>
-              <w:ind w:firstLine="0"/>
-              <w:jc w:val="left"/>
-            </w:pPr>
-            <w:r>
-              <w:rPr>
-                <w:rFonts w:ascii="Times New Roman" w:hAnsi="Times New Roman"/>
-                <w:sz w:val="18"/>
+              <w:spacing w:line="240" w:lineRule="auto" w:after="20"/>
+              <w:ind w:firstLine="0"/>
+              <w:jc w:val="left"/>
+            </w:pPr>
+            <w:r>
+              <w:rPr>
+                <w:b/>
+                <w:sz w:val="17"/>
               </w:rPr>
               <w:t xml:space="preserve">Responsable de ejecución</w:t>
             </w:r>
@@ -1226,14 +1242,14 @@
           <w:p>
             <w:pPr>
               <w:pStyle w:val="Compact"/>
-              <w:spacing w:line="240" w:lineRule="auto" w:after="0"/>
-              <w:ind w:firstLine="0"/>
-              <w:jc w:val="left"/>
-            </w:pPr>
-            <w:r>
-              <w:rPr>
-                <w:rFonts w:ascii="Times New Roman" w:hAnsi="Times New Roman"/>
-                <w:sz w:val="18"/>
+              <w:spacing w:line="240" w:lineRule="auto" w:after="20"/>
+              <w:ind w:firstLine="0"/>
+              <w:jc w:val="left"/>
+            </w:pPr>
+            <w:r>
+              <w:rPr>
+                <w:b/>
+                <w:sz w:val="17"/>
               </w:rPr>
               <w:t xml:space="preserve">Revisión / aprobación</w:t>
             </w:r>
@@ -1244,14 +1260,14 @@
           <w:p>
             <w:pPr>
               <w:pStyle w:val="Compact"/>
-              <w:spacing w:line="240" w:lineRule="auto" w:after="0"/>
-              <w:ind w:firstLine="0"/>
-              <w:jc w:val="left"/>
-            </w:pPr>
-            <w:r>
-              <w:rPr>
-                <w:rFonts w:ascii="Times New Roman" w:hAnsi="Times New Roman"/>
-                <w:sz w:val="18"/>
+              <w:spacing w:line="240" w:lineRule="auto" w:after="20"/>
+              <w:ind w:firstLine="0"/>
+              <w:jc w:val="left"/>
+            </w:pPr>
+            <w:r>
+              <w:rPr>
+                <w:b/>
+                <w:sz w:val="17"/>
               </w:rPr>
               <w:t xml:space="preserve">Evidencia mínima</w:t>
             </w:r>
@@ -1264,14 +1280,13 @@
           <w:p>
             <w:pPr>
               <w:pStyle w:val="Compact"/>
-              <w:spacing w:line="240" w:lineRule="auto" w:after="0"/>
-              <w:ind w:firstLine="0"/>
-              <w:jc w:val="left"/>
-            </w:pPr>
-            <w:r>
-              <w:rPr>
-                <w:rFonts w:ascii="Times New Roman" w:hAnsi="Times New Roman"/>
-                <w:sz w:val="18"/>
+              <w:spacing w:line="240" w:lineRule="auto" w:after="20"/>
+              <w:ind w:firstLine="0"/>
+              <w:jc w:val="left"/>
+            </w:pPr>
+            <w:r>
+              <w:rPr>
+                <w:sz w:val="17"/>
               </w:rPr>
               <w:t xml:space="preserve">Alcance de pedido</w:t>
             </w:r>
@@ -1282,14 +1297,13 @@
           <w:p>
             <w:pPr>
               <w:pStyle w:val="Compact"/>
-              <w:spacing w:line="240" w:lineRule="auto" w:after="0"/>
-              <w:ind w:firstLine="0"/>
-              <w:jc w:val="left"/>
-            </w:pPr>
-            <w:r>
-              <w:rPr>
-                <w:rFonts w:ascii="Times New Roman" w:hAnsi="Times New Roman"/>
-                <w:sz w:val="18"/>
+              <w:spacing w:line="240" w:lineRule="auto" w:after="20"/>
+              <w:ind w:firstLine="0"/>
+              <w:jc w:val="left"/>
+            </w:pPr>
+            <w:r>
+              <w:rPr>
+                <w:sz w:val="17"/>
               </w:rPr>
               <w:t xml:space="preserve">Analista funcional</w:t>
             </w:r>
@@ -1300,14 +1314,13 @@
           <w:p>
             <w:pPr>
               <w:pStyle w:val="Compact"/>
-              <w:spacing w:line="240" w:lineRule="auto" w:after="0"/>
-              <w:ind w:firstLine="0"/>
-              <w:jc w:val="left"/>
-            </w:pPr>
-            <w:r>
-              <w:rPr>
-                <w:rFonts w:ascii="Times New Roman" w:hAnsi="Times New Roman"/>
-                <w:sz w:val="18"/>
+              <w:spacing w:line="240" w:lineRule="auto" w:after="20"/>
+              <w:ind w:firstLine="0"/>
+              <w:jc w:val="left"/>
+            </w:pPr>
+            <w:r>
+              <w:rPr>
+                <w:sz w:val="17"/>
               </w:rPr>
               <w:t xml:space="preserve">Representante operativo</w:t>
             </w:r>
@@ -1318,14 +1331,13 @@
           <w:p>
             <w:pPr>
               <w:pStyle w:val="Compact"/>
-              <w:spacing w:line="240" w:lineRule="auto" w:after="0"/>
-              <w:ind w:firstLine="0"/>
-              <w:jc w:val="left"/>
-            </w:pPr>
-            <w:r>
-              <w:rPr>
-                <w:rFonts w:ascii="Times New Roman" w:hAnsi="Times New Roman"/>
-                <w:sz w:val="18"/>
+              <w:spacing w:line="240" w:lineRule="auto" w:after="20"/>
+              <w:ind w:firstLine="0"/>
+              <w:jc w:val="left"/>
+            </w:pPr>
+            <w:r>
+              <w:rPr>
+                <w:sz w:val="17"/>
               </w:rPr>
               <w:t xml:space="preserve">SRS y acta</w:t>
             </w:r>
@@ -1338,14 +1350,13 @@
           <w:p>
             <w:pPr>
               <w:pStyle w:val="Compact"/>
-              <w:spacing w:line="240" w:lineRule="auto" w:after="0"/>
-              <w:ind w:firstLine="0"/>
-              <w:jc w:val="left"/>
-            </w:pPr>
-            <w:r>
-              <w:rPr>
-                <w:rFonts w:ascii="Times New Roman" w:hAnsi="Times New Roman"/>
-                <w:sz w:val="18"/>
+              <w:spacing w:line="240" w:lineRule="auto" w:after="20"/>
+              <w:ind w:firstLine="0"/>
+              <w:jc w:val="left"/>
+            </w:pPr>
+            <w:r>
+              <w:rPr>
+                <w:sz w:val="17"/>
               </w:rPr>
               <w:t xml:space="preserve">Cambios API</w:t>
             </w:r>
@@ -1356,14 +1367,13 @@
           <w:p>
             <w:pPr>
               <w:pStyle w:val="Compact"/>
-              <w:spacing w:line="240" w:lineRule="auto" w:after="0"/>
-              <w:ind w:firstLine="0"/>
-              <w:jc w:val="left"/>
-            </w:pPr>
-            <w:r>
-              <w:rPr>
-                <w:rFonts w:ascii="Times New Roman" w:hAnsi="Times New Roman"/>
-                <w:sz w:val="18"/>
+              <w:spacing w:line="240" w:lineRule="auto" w:after="20"/>
+              <w:ind w:firstLine="0"/>
+              <w:jc w:val="left"/>
+            </w:pPr>
+            <w:r>
+              <w:rPr>
+                <w:sz w:val="17"/>
               </w:rPr>
               <w:t xml:space="preserve">Backend</w:t>
             </w:r>
@@ -1374,14 +1384,13 @@
           <w:p>
             <w:pPr>
               <w:pStyle w:val="Compact"/>
-              <w:spacing w:line="240" w:lineRule="auto" w:after="0"/>
-              <w:ind w:firstLine="0"/>
-              <w:jc w:val="left"/>
-            </w:pPr>
-            <w:r>
-              <w:rPr>
-                <w:rFonts w:ascii="Times New Roman" w:hAnsi="Times New Roman"/>
-                <w:sz w:val="18"/>
+              <w:spacing w:line="240" w:lineRule="auto" w:after="20"/>
+              <w:ind w:firstLine="0"/>
+              <w:jc w:val="left"/>
+            </w:pPr>
+            <w:r>
+              <w:rPr>
+                <w:sz w:val="17"/>
               </w:rPr>
               <w:t xml:space="preserve">Líder técnico y clientes</w:t>
             </w:r>
@@ -1392,14 +1401,13 @@
           <w:p>
             <w:pPr>
               <w:pStyle w:val="Compact"/>
-              <w:spacing w:line="240" w:lineRule="auto" w:after="0"/>
-              <w:ind w:firstLine="0"/>
-              <w:jc w:val="left"/>
-            </w:pPr>
-            <w:r>
-              <w:rPr>
-                <w:rFonts w:ascii="Times New Roman" w:hAnsi="Times New Roman"/>
-                <w:sz w:val="18"/>
+              <w:spacing w:line="240" w:lineRule="auto" w:after="20"/>
+              <w:ind w:firstLine="0"/>
+              <w:jc w:val="left"/>
+            </w:pPr>
+            <w:r>
+              <w:rPr>
+                <w:sz w:val="17"/>
               </w:rPr>
               <w:t xml:space="preserve">OpenAPI y casos de prueba</w:t>
             </w:r>
@@ -1412,14 +1420,13 @@
           <w:p>
             <w:pPr>
               <w:pStyle w:val="Compact"/>
-              <w:spacing w:line="240" w:lineRule="auto" w:after="0"/>
-              <w:ind w:firstLine="0"/>
-              <w:jc w:val="left"/>
-            </w:pPr>
-            <w:r>
-              <w:rPr>
-                <w:rFonts w:ascii="Times New Roman" w:hAnsi="Times New Roman"/>
-                <w:sz w:val="18"/>
+              <w:spacing w:line="240" w:lineRule="auto" w:after="20"/>
+              <w:ind w:firstLine="0"/>
+              <w:jc w:val="left"/>
+            </w:pPr>
+            <w:r>
+              <w:rPr>
+                <w:sz w:val="17"/>
               </w:rPr>
               <w:t xml:space="preserve">Validación de caja/pagos</w:t>
             </w:r>
@@ -1430,14 +1437,13 @@
           <w:p>
             <w:pPr>
               <w:pStyle w:val="Compact"/>
-              <w:spacing w:line="240" w:lineRule="auto" w:after="0"/>
-              <w:ind w:firstLine="0"/>
-              <w:jc w:val="left"/>
-            </w:pPr>
-            <w:r>
-              <w:rPr>
-                <w:rFonts w:ascii="Times New Roman" w:hAnsi="Times New Roman"/>
-                <w:sz w:val="18"/>
+              <w:spacing w:line="240" w:lineRule="auto" w:after="20"/>
+              <w:ind w:firstLine="0"/>
+              <w:jc w:val="left"/>
+            </w:pPr>
+            <w:r>
+              <w:rPr>
+                <w:sz w:val="17"/>
               </w:rPr>
               <w:t xml:space="preserve">Integraciones</w:t>
             </w:r>
@@ -1448,14 +1454,13 @@
           <w:p>
             <w:pPr>
               <w:pStyle w:val="Compact"/>
-              <w:spacing w:line="240" w:lineRule="auto" w:after="0"/>
-              <w:ind w:firstLine="0"/>
-              <w:jc w:val="left"/>
-            </w:pPr>
-            <w:r>
-              <w:rPr>
-                <w:rFonts w:ascii="Times New Roman" w:hAnsi="Times New Roman"/>
-                <w:sz w:val="18"/>
+              <w:spacing w:line="240" w:lineRule="auto" w:after="20"/>
+              <w:ind w:firstLine="0"/>
+              <w:jc w:val="left"/>
+            </w:pPr>
+            <w:r>
+              <w:rPr>
+                <w:sz w:val="17"/>
               </w:rPr>
               <w:t xml:space="preserve">QA y operaciones</w:t>
             </w:r>
@@ -1466,14 +1471,13 @@
           <w:p>
             <w:pPr>
               <w:pStyle w:val="Compact"/>
-              <w:spacing w:line="240" w:lineRule="auto" w:after="0"/>
-              <w:ind w:firstLine="0"/>
-              <w:jc w:val="left"/>
-            </w:pPr>
-            <w:r>
-              <w:rPr>
-                <w:rFonts w:ascii="Times New Roman" w:hAnsi="Times New Roman"/>
-                <w:sz w:val="18"/>
+              <w:spacing w:line="240" w:lineRule="auto" w:after="20"/>
+              <w:ind w:firstLine="0"/>
+              <w:jc w:val="left"/>
+            </w:pPr>
+            <w:r>
+              <w:rPr>
+                <w:sz w:val="17"/>
               </w:rPr>
               <w:t xml:space="preserve">Pruebas sandbox y conciliación</w:t>
             </w:r>
@@ -1486,14 +1490,13 @@
           <w:p>
             <w:pPr>
               <w:pStyle w:val="Compact"/>
-              <w:spacing w:line="240" w:lineRule="auto" w:after="0"/>
-              <w:ind w:firstLine="0"/>
-              <w:jc w:val="left"/>
-            </w:pPr>
-            <w:r>
-              <w:rPr>
-                <w:rFonts w:ascii="Times New Roman" w:hAnsi="Times New Roman"/>
-                <w:sz w:val="18"/>
+              <w:spacing w:line="240" w:lineRule="auto" w:after="20"/>
+              <w:ind w:firstLine="0"/>
+              <w:jc w:val="left"/>
+            </w:pPr>
+            <w:r>
+              <w:rPr>
+                <w:sz w:val="17"/>
               </w:rPr>
               <w:t xml:space="preserve">Entregas y tracking</w:t>
             </w:r>
@@ -1504,14 +1507,13 @@
           <w:p>
             <w:pPr>
               <w:pStyle w:val="Compact"/>
-              <w:spacing w:line="240" w:lineRule="auto" w:after="0"/>
-              <w:ind w:firstLine="0"/>
-              <w:jc w:val="left"/>
-            </w:pPr>
-            <w:r>
-              <w:rPr>
-                <w:rFonts w:ascii="Times New Roman" w:hAnsi="Times New Roman"/>
-                <w:sz w:val="18"/>
+              <w:spacing w:line="240" w:lineRule="auto" w:after="20"/>
+              <w:ind w:firstLine="0"/>
+              <w:jc w:val="left"/>
+            </w:pPr>
+            <w:r>
+              <w:rPr>
+                <w:sz w:val="17"/>
               </w:rPr>
               <w:t xml:space="preserve">Móvil / backend</w:t>
             </w:r>
@@ -1522,14 +1524,13 @@
           <w:p>
             <w:pPr>
               <w:pStyle w:val="Compact"/>
-              <w:spacing w:line="240" w:lineRule="auto" w:after="0"/>
-              <w:ind w:firstLine="0"/>
-              <w:jc w:val="left"/>
-            </w:pPr>
-            <w:r>
-              <w:rPr>
-                <w:rFonts w:ascii="Times New Roman" w:hAnsi="Times New Roman"/>
-                <w:sz w:val="18"/>
+              <w:spacing w:line="240" w:lineRule="auto" w:after="20"/>
+              <w:ind w:firstLine="0"/>
+              <w:jc w:val="left"/>
+            </w:pPr>
+            <w:r>
+              <w:rPr>
+                <w:sz w:val="17"/>
               </w:rPr>
               <w:t xml:space="preserve">Operaciones y QA</w:t>
             </w:r>
@@ -1540,14 +1541,13 @@
           <w:p>
             <w:pPr>
               <w:pStyle w:val="Compact"/>
-              <w:spacing w:line="240" w:lineRule="auto" w:after="0"/>
-              <w:ind w:firstLine="0"/>
-              <w:jc w:val="left"/>
-            </w:pPr>
-            <w:r>
-              <w:rPr>
-                <w:rFonts w:ascii="Times New Roman" w:hAnsi="Times New Roman"/>
-                <w:sz w:val="18"/>
+              <w:spacing w:line="240" w:lineRule="auto" w:after="20"/>
+              <w:ind w:firstLine="0"/>
+              <w:jc w:val="left"/>
+            </w:pPr>
+            <w:r>
+              <w:rPr>
+                <w:sz w:val="17"/>
               </w:rPr>
               <w:t xml:space="preserve">Caso de entrega sintético</w:t>
             </w:r>
@@ -1560,14 +1560,13 @@
           <w:p>
             <w:pPr>
               <w:pStyle w:val="Compact"/>
-              <w:spacing w:line="240" w:lineRule="auto" w:after="0"/>
-              <w:ind w:firstLine="0"/>
-              <w:jc w:val="left"/>
-            </w:pPr>
-            <w:r>
-              <w:rPr>
-                <w:rFonts w:ascii="Times New Roman" w:hAnsi="Times New Roman"/>
-                <w:sz w:val="18"/>
+              <w:spacing w:line="240" w:lineRule="auto" w:after="20"/>
+              <w:ind w:firstLine="0"/>
+              <w:jc w:val="left"/>
+            </w:pPr>
+            <w:r>
+              <w:rPr>
+                <w:sz w:val="17"/>
               </w:rPr>
               <w:t xml:space="preserve">Documentación</w:t>
             </w:r>
@@ -1578,14 +1577,13 @@
           <w:p>
             <w:pPr>
               <w:pStyle w:val="Compact"/>
-              <w:spacing w:line="240" w:lineRule="auto" w:after="0"/>
-              <w:ind w:firstLine="0"/>
-              <w:jc w:val="left"/>
-            </w:pPr>
-            <w:r>
-              <w:rPr>
-                <w:rFonts w:ascii="Times New Roman" w:hAnsi="Times New Roman"/>
-                <w:sz w:val="18"/>
+              <w:spacing w:line="240" w:lineRule="auto" w:after="20"/>
+              <w:ind w:firstLine="0"/>
+              <w:jc w:val="left"/>
+            </w:pPr>
+            <w:r>
+              <w:rPr>
+                <w:sz w:val="17"/>
               </w:rPr>
               <w:t xml:space="preserve">Responsable documental</w:t>
             </w:r>
@@ -1596,14 +1594,13 @@
           <w:p>
             <w:pPr>
               <w:pStyle w:val="Compact"/>
-              <w:spacing w:line="240" w:lineRule="auto" w:after="0"/>
-              <w:ind w:firstLine="0"/>
-              <w:jc w:val="left"/>
-            </w:pPr>
-            <w:r>
-              <w:rPr>
-                <w:rFonts w:ascii="Times New Roman" w:hAnsi="Times New Roman"/>
-                <w:sz w:val="18"/>
+              <w:spacing w:line="240" w:lineRule="auto" w:after="20"/>
+              <w:ind w:firstLine="0"/>
+              <w:jc w:val="left"/>
+            </w:pPr>
+            <w:r>
+              <w:rPr>
+                <w:sz w:val="17"/>
               </w:rPr>
               <w:t xml:space="preserve">Líder técnico/instructor</w:t>
             </w:r>
@@ -1614,14 +1611,13 @@
           <w:p>
             <w:pPr>
               <w:pStyle w:val="Compact"/>
-              <w:spacing w:line="240" w:lineRule="auto" w:after="0"/>
-              <w:ind w:firstLine="0"/>
-              <w:jc w:val="left"/>
-            </w:pPr>
-            <w:r>
-              <w:rPr>
-                <w:rFonts w:ascii="Times New Roman" w:hAnsi="Times New Roman"/>
-                <w:sz w:val="18"/>
+              <w:spacing w:line="240" w:lineRule="auto" w:after="20"/>
+              <w:ind w:firstLine="0"/>
+              <w:jc w:val="left"/>
+            </w:pPr>
+            <w:r>
+              <w:rPr>
+                <w:sz w:val="17"/>
               </w:rPr>
               <w:t xml:space="preserve">Commit, versión y aprobaciones</w:t>
             </w:r>
@@ -1634,14 +1630,13 @@
           <w:p>
             <w:pPr>
               <w:pStyle w:val="Compact"/>
-              <w:spacing w:line="240" w:lineRule="auto" w:after="0"/>
-              <w:ind w:firstLine="0"/>
-              <w:jc w:val="left"/>
-            </w:pPr>
-            <w:r>
-              <w:rPr>
-                <w:rFonts w:ascii="Times New Roman" w:hAnsi="Times New Roman"/>
-                <w:sz w:val="18"/>
+              <w:spacing w:line="240" w:lineRule="auto" w:after="20"/>
+              <w:ind w:firstLine="0"/>
+              <w:jc w:val="left"/>
+            </w:pPr>
+            <w:r>
+              <w:rPr>
+                <w:sz w:val="17"/>
               </w:rPr>
               <w:t xml:space="preserve">Seguridad</w:t>
             </w:r>
@@ -1652,14 +1647,13 @@
           <w:p>
             <w:pPr>
               <w:pStyle w:val="Compact"/>
-              <w:spacing w:line="240" w:lineRule="auto" w:after="0"/>
-              <w:ind w:firstLine="0"/>
-              <w:jc w:val="left"/>
-            </w:pPr>
-            <w:r>
-              <w:rPr>
-                <w:rFonts w:ascii="Times New Roman" w:hAnsi="Times New Roman"/>
-                <w:sz w:val="18"/>
+              <w:spacing w:line="240" w:lineRule="auto" w:after="20"/>
+              <w:ind w:firstLine="0"/>
+              <w:jc w:val="left"/>
+            </w:pPr>
+            <w:r>
+              <w:rPr>
+                <w:sz w:val="17"/>
               </w:rPr>
               <w:t xml:space="preserve">Responsable designado</w:t>
             </w:r>
@@ -1670,14 +1664,13 @@
           <w:p>
             <w:pPr>
               <w:pStyle w:val="Compact"/>
-              <w:spacing w:line="240" w:lineRule="auto" w:after="0"/>
-              <w:ind w:firstLine="0"/>
-              <w:jc w:val="left"/>
-            </w:pPr>
-            <w:r>
-              <w:rPr>
-                <w:rFonts w:ascii="Times New Roman" w:hAnsi="Times New Roman"/>
-                <w:sz w:val="18"/>
+              <w:spacing w:line="240" w:lineRule="auto" w:after="20"/>
+              <w:ind w:firstLine="0"/>
+              <w:jc w:val="left"/>
+            </w:pPr>
+            <w:r>
+              <w:rPr>
+                <w:sz w:val="17"/>
               </w:rPr>
               <w:t xml:space="preserve">Líder técnico</w:t>
             </w:r>
@@ -1688,14 +1681,13 @@
           <w:p>
             <w:pPr>
               <w:pStyle w:val="Compact"/>
-              <w:spacing w:line="240" w:lineRule="auto" w:after="0"/>
-              <w:ind w:firstLine="0"/>
-              <w:jc w:val="left"/>
-            </w:pPr>
-            <w:r>
-              <w:rPr>
-                <w:rFonts w:ascii="Times New Roman" w:hAnsi="Times New Roman"/>
-                <w:sz w:val="18"/>
+              <w:spacing w:line="240" w:lineRule="auto" w:after="20"/>
+              <w:ind w:firstLine="0"/>
+              <w:jc w:val="left"/>
+            </w:pPr>
+            <w:r>
+              <w:rPr>
+                <w:sz w:val="17"/>
               </w:rPr>
               <w:t xml:space="preserve">Matriz de riesgos y remediación</w:t>
             </w:r>
@@ -1710,20 +1702,16 @@
       <w:pPr>
         <w:pStyle w:val="Heading2"/>
         <w:keepNext/>
-        <w:ind w:firstLine="0"/>
-      </w:pPr>
-      <w:r>
-        <w:rPr>
-          <w:color w:val="000000"/>
-        </w:rPr>
+        <w:spacing w:line="264" w:lineRule="auto"/>
+      </w:pPr>
+      <w:r>
         <w:t xml:space="preserve">11. Criterios de transición de etapas</w:t>
       </w:r>
     </w:p>
     <w:p>
       <w:pPr>
         <w:pStyle w:val="FirstParagraph"/>
-        <w:spacing w:line="480" w:lineRule="auto" w:after="0"/>
-        <w:ind w:firstLine="720"/>
+        <w:spacing w:line="396" w:lineRule="auto" w:after="100"/>
       </w:pPr>
       <w:r>
         <w:rPr>
@@ -1806,8 +1794,7 @@
     <w:p>
       <w:pPr>
         <w:pStyle w:val="BodyText"/>
-        <w:spacing w:line="480" w:lineRule="auto" w:after="0"/>
-        <w:ind w:firstLine="720"/>
+        <w:spacing w:line="396" w:lineRule="auto" w:after="100"/>
       </w:pPr>
       <w:r>
         <w:t xml:space="preserve">No se considera cumplido un hito por disponer únicamente del archivo que lo nombra. Una matriz con evidencia, fecha y firma debe acompañarlo. El cierre académico es distinto del despliegue comercial.</w:t>
@@ -1819,20 +1806,16 @@
       <w:pPr>
         <w:pStyle w:val="Heading2"/>
         <w:keepNext/>
-        <w:ind w:firstLine="0"/>
-      </w:pPr>
-      <w:r>
-        <w:rPr>
-          <w:color w:val="000000"/>
-        </w:rPr>
+        <w:spacing w:line="264" w:lineRule="auto"/>
+      </w:pPr>
+      <w:r>
         <w:t xml:space="preserve">12. Supuestos, restricciones y condiciones de éxito</w:t>
       </w:r>
     </w:p>
     <w:p>
       <w:pPr>
         <w:pStyle w:val="FirstParagraph"/>
-        <w:spacing w:line="480" w:lineRule="auto" w:after="0"/>
-        <w:ind w:firstLine="720"/>
+        <w:spacing w:line="396" w:lineRule="auto" w:after="100"/>
       </w:pPr>
       <w:r>
         <w:t xml:space="preserve">Se asume que el equipo podrá ejecutar los tres proyectos con configuraciones compatibles, que la pasarela de pago ofrece sandbox y que la base de datos de prueba podrá reconstruirse sin usar información de clientes. Las restricciones son el acceso a infraestructura operativa, licencias y secretos, la necesidad de coordinación entre tres repositorios y los límites de verificación estática. La adopción real y la rentabilidad no son indicadores que puedan concluirse mediante revisión de código.</w:t>
@@ -1841,8 +1824,7 @@
     <w:p>
       <w:pPr>
         <w:pStyle w:val="BodyText"/>
-        <w:spacing w:line="480" w:lineRule="auto" w:after="0"/>
-        <w:ind w:firstLine="720"/>
+        <w:spacing w:line="396" w:lineRule="auto" w:after="100"/>
       </w:pPr>
       <w:r>
         <w:t xml:space="preserve">Se considerará éxito documental cuando: todos los documentos de la matriz tengan contenido y control de versión; los hallazgos apunten a archivos verificables; las referencias científicas puedan localizarse; la SRS se relacione con escenarios de prueba; los manuales permitan un arranque en entorno nuevo; y las pruebas no realizadas se mantengan señaladas hasta producir evidencia auténtica.</w:t>
@@ -1854,12 +1836,9 @@
       <w:pPr>
         <w:pStyle w:val="Heading2"/>
         <w:keepNext/>
-        <w:ind w:firstLine="0"/>
-      </w:pPr>
-      <w:r>
-        <w:rPr>
-          <w:color w:val="000000"/>
-        </w:rPr>
+        <w:spacing w:line="264" w:lineRule="auto"/>
+      </w:pPr>
+      <w:r>
         <w:t xml:space="preserve">Fuentes primarias de implementación</w:t>
       </w:r>
     </w:p>
@@ -1870,6 +1849,7 @@
           <w:ilvl w:val="0"/>
           <w:numId w:val="1002"/>
         </w:numPr>
+        <w:spacing w:line="396" w:lineRule="auto" w:after="100"/>
       </w:pPr>
       <w:r>
         <w:t xml:space="preserve">API: https://github.com/yersonct/SaborExpressBack/tree/main</w:t>
@@ -1882,6 +1862,7 @@
           <w:ilvl w:val="0"/>
           <w:numId w:val="1002"/>
         </w:numPr>
+        <w:spacing w:line="396" w:lineRule="auto" w:after="100"/>
       </w:pPr>
       <w:r>
         <w:t xml:space="preserve">Web: https://github.com/yersonct/SaborExpressWeb/tree/main</w:t>
@@ -1894,6 +1875,7 @@
           <w:ilvl w:val="0"/>
           <w:numId w:val="1002"/>
         </w:numPr>
+        <w:spacing w:line="396" w:lineRule="auto" w:after="100"/>
       </w:pPr>
       <w:r>
         <w:t xml:space="preserve">Móvil: https://github.com/yersonct/SaborExpressMovil/tree/main</w:t>
@@ -1906,6 +1888,7 @@
           <w:ilvl w:val="0"/>
           <w:numId w:val="1002"/>
         </w:numPr>
+        <w:spacing w:line="396" w:lineRule="auto" w:after="100"/>
       </w:pPr>
       <w:r>
         <w:t xml:space="preserve">Referencia de presentación: https://github.com/jsgh1/SRD-v1/tree/dev/docs/docs-SRD</w:t>
@@ -1914,8 +1897,7 @@
     <w:p>
       <w:pPr>
         <w:pStyle w:val="FirstParagraph"/>
-        <w:spacing w:line="480" w:lineRule="auto" w:after="0"/>
-        <w:ind w:firstLine="720"/>
+        <w:spacing w:line="396" w:lineRule="auto" w:after="100"/>
       </w:pPr>
       <w:r>
         <w:rPr>
@@ -1932,10 +1914,229 @@
       </w:r>
     </w:p>
     <w:bookmarkEnd w:id="34"/>
+    <w:bookmarkStart w:id="35" w:name="X4c39d7b68eb12b2a3baef0bf0b86c79beb775b9"/>
+    <w:p>
+      <w:pPr>
+        <w:pStyle w:val="Heading2"/>
+        <w:keepNext/>
+        <w:spacing w:line="264" w:lineRule="auto"/>
+      </w:pPr>
+      <w:r>
+        <w:t xml:space="preserve">12. Identificación del proyecto y patrocinio académico</w:t>
+      </w:r>
+    </w:p>
+    <w:p>
+      <w:pPr>
+        <w:pStyle w:val="FirstParagraph"/>
+        <w:spacing w:line="396" w:lineRule="auto" w:after="100"/>
+      </w:pPr>
+      <w:r>
+        <w:rPr>
+          <w:b/>
+          <w:bCs/>
+        </w:rPr>
+        <w:t xml:space="preserve">Responsable del documento y participante reportado:</w:t>
+      </w:r>
+      <w:r>
+        <w:t xml:space="preserve"> </w:t>
+      </w:r>
+      <w:r>
+        <w:t xml:space="preserve">Yerson Stiven Cuellar Rubiano, ficha 3145555. La denominación de programa, instructor, centro de formación, patrocinador, fecha de aprobación y firmas no fueron suministradas y no se sustituyen por datos imaginados. Se requieren registros auténticos para declarar el acta aprobada.</w:t>
+      </w:r>
+    </w:p>
+    <w:p>
+      <w:pPr>
+        <w:pStyle w:val="BodyText"/>
+        <w:spacing w:line="396" w:lineRule="auto" w:after="100"/>
+      </w:pPr>
+      <w:r>
+        <w:rPr>
+          <w:b/>
+          <w:bCs/>
+        </w:rPr>
+        <w:t xml:space="preserve">Necesidad de negocio identificada:</w:t>
+      </w:r>
+      <w:r>
+        <w:t xml:space="preserve"> </w:t>
+      </w:r>
+      <w:r>
+        <w:t xml:space="preserve">coordinación de la operación gastronómica en múltiples sedes y canales, evitando duplicidad en pedidos y falta de continuidad informativa entre caja, cocina, repartidores y administración. La investigación documental permite formular hipótesis sobre mejora operativa, pero no demostrar beneficios cuantificados sin una línea base de tiempos, fallas y satisfacción.</w:t>
+      </w:r>
+    </w:p>
+    <w:p>
+      <w:pPr>
+        <w:pStyle w:val="BodyText"/>
+        <w:spacing w:line="396" w:lineRule="auto" w:after="100"/>
+      </w:pPr>
+      <w:r>
+        <w:rPr>
+          <w:b/>
+          <w:bCs/>
+        </w:rPr>
+        <w:t xml:space="preserve">Resultados de proyecto:</w:t>
+      </w:r>
+      <w:r>
+        <w:t xml:space="preserve"> </w:t>
+      </w:r>
+      <w:r>
+        <w:t xml:space="preserve">especificación formal RF/RNF, diseño validable, API documentada, clientes web/móvil trazables, persistencia con migraciones, manuales de operación y calidad, casos de prueba y artículo de estudio de caso. Se define como cierre documental la entrega de evidencias verificables y la validación del instructor, no solamente el número de páginas.</w:t>
+      </w:r>
+    </w:p>
     <w:bookmarkEnd w:id="35"/>
+    <w:bookmarkStart w:id="39" w:name="Xa282386ca857917888924f76b0210d728bc8f50"/>
+    <w:p>
+      <w:pPr>
+        <w:pStyle w:val="Heading2"/>
+        <w:keepNext/>
+        <w:spacing w:line="264" w:lineRule="auto"/>
+      </w:pPr>
+      <w:r>
+        <w:t xml:space="preserve">13. Restricciones, supuestos y criterios de decisión</w:t>
+      </w:r>
+    </w:p>
+    <w:p>
+      <w:pPr>
+        <w:pStyle w:val="FirstParagraph"/>
+        <w:spacing w:line="396" w:lineRule="auto" w:after="100"/>
+      </w:pPr>
+      <w:r>
+        <w:t xml:space="preserve">El trabajo toma como fuente tres repositorios: backend</w:t>
+      </w:r>
+      <w:r>
+        <w:t xml:space="preserve"> </w:t>
+      </w:r>
+      <w:r>
+        <w:rPr>
+          <w:rStyle w:val="VerbatimChar"/>
+        </w:rPr>
+        <w:t xml:space="preserve">SaborExpressBack</w:t>
+      </w:r>
+      <w:r>
+        <w:t xml:space="preserve">, frontend</w:t>
+      </w:r>
+      <w:r>
+        <w:t xml:space="preserve"> </w:t>
+      </w:r>
+      <w:r>
+        <w:rPr>
+          <w:rStyle w:val="VerbatimChar"/>
+        </w:rPr>
+        <w:t xml:space="preserve">SaborExpressWeb</w:t>
+      </w:r>
+      <w:r>
+        <w:t xml:space="preserve"> </w:t>
+      </w:r>
+      <w:r>
+        <w:t xml:space="preserve">y móvil</w:t>
+      </w:r>
+      <w:r>
+        <w:t xml:space="preserve"> </w:t>
+      </w:r>
+      <w:r>
+        <w:rPr>
+          <w:rStyle w:val="VerbatimChar"/>
+        </w:rPr>
+        <w:t xml:space="preserve">SaborExpressMovil</w:t>
+      </w:r>
+      <w:r>
+        <w:t xml:space="preserve">. Ningún repositorio demuestra por sí mismo pagos de producción, respaldos realizados, aceptación del usuario o un servidor desplegado. Se presupone acceso autorizado a un entorno de desarrollo para ejecutar QA en el futuro; la ejecución queda condicionada a credenciales y datos sintéticos.</w:t>
+      </w:r>
+    </w:p>
+    <w:p>
+      <w:pPr>
+        <w:pStyle w:val="BodyText"/>
+        <w:spacing w:line="396" w:lineRule="auto" w:after="100"/>
+      </w:pPr>
+      <w:r>
+        <w:rPr>
+          <w:b/>
+          <w:bCs/>
+        </w:rPr>
+        <w:t xml:space="preserve">Reglas de decisión:</w:t>
+      </w:r>
+      <w:r>
+        <w:t xml:space="preserve"> </w:t>
+      </w:r>
+      <w:r>
+        <w:t xml:space="preserve">aprobar un hito únicamente cuando existan artefactos versionados; evitar deuda de seguridad crítica abierta al publicar; no pasar de Wompi sandbox a productivo sin consentimiento y revisión; registrar riesgos por responsable y fecha; mantener trazabilidad desde requisitos hasta ejecución.</w:t>
+      </w:r>
+    </w:p>
+    <w:p>
+      <w:pPr>
+        <w:pStyle w:val="CaptionedFigure"/>
+        <w:spacing w:line="396" w:lineRule="auto" w:after="100"/>
+      </w:pPr>
+      <w:r>
+        <w:drawing>
+          <wp:inline>
+            <wp:extent cx="5943600" cy="4413163"/>
+            <wp:effectExtent b="0" l="0" r="0" t="0"/>
+            <wp:docPr descr="01_CONTEXT0" title="" id="37" name="Picture"/>
+            <a:graphic>
+              <a:graphicData uri="http://schemas.openxmlformats.org/drawingml/2006/picture">
+                <pic:pic>
+                  <pic:nvPicPr>
+                    <pic:cNvPr descr="recursos/01_CONTEXT0.png" id="38" name="Picture"/>
+                    <pic:cNvPicPr>
+                      <a:picLocks noChangeArrowheads="1" noChangeAspect="1"/>
+                    </pic:cNvPicPr>
+                  </pic:nvPicPr>
+                  <pic:blipFill>
+                    <a:blip r:embed="rId36"/>
+                    <a:stretch>
+                      <a:fillRect/>
+                    </a:stretch>
+                  </pic:blipFill>
+                  <pic:spPr bwMode="auto">
+                    <a:xfrm>
+                      <a:off x="0" y="0"/>
+                      <a:ext cx="5943600" cy="4413163"/>
+                    </a:xfrm>
+                    <a:prstGeom prst="rect">
+                      <a:avLst/>
+                    </a:prstGeom>
+                    <a:noFill/>
+                    <a:ln w="9525">
+                      <a:noFill/>
+                      <a:headEnd/>
+                      <a:tailEnd/>
+                    </a:ln>
+                  </pic:spPr>
+                </pic:pic>
+              </a:graphicData>
+            </a:graphic>
+          </wp:inline>
+        </w:drawing>
+      </w:r>
+    </w:p>
+    <w:p>
+      <w:pPr>
+        <w:pStyle w:val="ImageCaption"/>
+        <w:spacing w:line="396" w:lineRule="auto" w:after="100"/>
+      </w:pPr>
+      <w:r>
+        <w:t xml:space="preserve">01_CONTEXT0</w:t>
+      </w:r>
+    </w:p>
+    <w:p>
+      <w:pPr>
+        <w:pStyle w:val="BodyText"/>
+        <w:spacing w:line="396" w:lineRule="auto" w:after="100"/>
+      </w:pPr>
+      <w:r>
+        <w:rPr>
+          <w:i/>
+          <w:iCs/>
+        </w:rPr>
+        <w:t xml:space="preserve">Nota. Elaboración para el estudio de caso SaborExpress; las figuras no certifican operaciones desplegadas.</w:t>
+      </w:r>
+    </w:p>
+    <w:bookmarkEnd w:id="39"/>
+    <w:bookmarkEnd w:id="40"/>
     <w:sectPr>
-      <w:headerReference r:id="rId9" w:type="default"/>
-      <w:pgMar w:bottom="1440" w:left="1440" w:right="1440" w:top="1440"/>
+      <w:footerReference w:type="default" r:id="rId10"/>
+      <w:pgSz w:h="15840" w:w="12240"/>
+      <w:pgMar w:bottom="1440" w:left="1440" w:right="1440" w:top="1440" w:header="691" w:footer="720"/>
     </w:sectPr>
   </w:body>
 </w:document>
@@ -1945,6 +2146,24 @@
 <w:comments xmlns:w="http://schemas.openxmlformats.org/wordprocessingml/2006/main" xmlns:m="http://schemas.openxmlformats.org/officeDocument/2006/math" xmlns:r="http://schemas.openxmlformats.org/officeDocument/2006/relationships" xmlns:o="urn:schemas-microsoft-com:office:office" xmlns:v="urn:schemas-microsoft-com:vml" xmlns:w10="urn:schemas-microsoft-com:office:word" xmlns:a="http://schemas.openxmlformats.org/drawingml/2006/main" xmlns:pic="http://schemas.openxmlformats.org/drawingml/2006/picture" xmlns:wp="http://schemas.openxmlformats.org/drawingml/2006/wordprocessingDrawing"/>
 </file>
 
+<file path=word/footer1.xml><?xml version="1.0" encoding="utf-8"?>
+<w:ftr xmlns:m="http://schemas.openxmlformats.org/officeDocument/2006/math" xmlns:mc="http://schemas.openxmlformats.org/markup-compatibility/2006" xmlns:mo="http://schemas.microsoft.com/office/mac/office/2008/main" xmlns:mv="urn:schemas-microsoft-com:mac:vml" xmlns:o="urn:schemas-microsoft-com:office:office" xmlns:r="http://schemas.openxmlformats.org/officeDocument/2006/relationships" xmlns:v="urn:schemas-microsoft-com:vml" xmlns:w10="urn:schemas-microsoft-com:office:word" xmlns:w14="http://schemas.microsoft.com/office/word/2010/wordml" xmlns:w="http://schemas.openxmlformats.org/wordprocessingml/2006/main" xmlns:wne="http://schemas.microsoft.com/office/word/2006/wordml" xmlns:wp14="http://schemas.microsoft.com/office/word/2010/wordprocessingDrawing" xmlns:wp="http://schemas.openxmlformats.org/drawingml/2006/wordprocessingDrawing" xmlns:wpc="http://schemas.microsoft.com/office/word/2010/wordprocessingCanvas" xmlns:wpg="http://schemas.microsoft.com/office/word/2010/wordprocessingGroup" xmlns:wpi="http://schemas.microsoft.com/office/word/2010/wordprocessingInk" xmlns:wps="http://schemas.microsoft.com/office/word/2010/wordprocessingShape" mc:Ignorable="w14 wp14">
+  <w:p>
+    <w:pPr>
+      <w:pStyle w:val="Footer"/>
+      <w:jc w:val="right"/>
+    </w:pPr>
+    <w:r>
+      <w:rPr>
+        <w:sz w:val="16"/>
+      </w:rPr>
+      <w:t xml:space="preserve">SaborExpress | Yerson Stiven Cuellar Rubiano | Ficha 3145555 | Página </w:t>
+    </w:r>
+    <w:fldSimple w:instr="PAGE"/>
+  </w:p>
+</w:ftr>
+</file>
+
 <file path=word/footnotes.xml><?xml version="1.0" encoding="utf-8"?>
 <w:footnotes xmlns:w="http://schemas.openxmlformats.org/wordprocessingml/2006/main" xmlns:m="http://schemas.openxmlformats.org/officeDocument/2006/math" xmlns:r="http://schemas.openxmlformats.org/officeDocument/2006/relationships" xmlns:o="urn:schemas-microsoft-com:office:office" xmlns:v="urn:schemas-microsoft-com:vml" xmlns:w10="urn:schemas-microsoft-com:office:word" xmlns:a="http://schemas.openxmlformats.org/drawingml/2006/main" xmlns:pic="http://schemas.openxmlformats.org/drawingml/2006/picture" xmlns:wp="http://schemas.openxmlformats.org/drawingml/2006/wordprocessingDrawing">
   <w:footnote w:type="continuationSeparator" w:id="0">
@@ -1962,18 +2181,6 @@
     </w:p>
   </w:footnote>
 </w:footnotes>
-</file>
-
-<file path=word/header1.xml><?xml version="1.0" encoding="utf-8"?>
-<w:hdr xmlns:m="http://schemas.openxmlformats.org/officeDocument/2006/math" xmlns:mc="http://schemas.openxmlformats.org/markup-compatibility/2006" xmlns:mo="http://schemas.microsoft.com/office/mac/office/2008/main" xmlns:mv="urn:schemas-microsoft-com:mac:vml" xmlns:o="urn:schemas-microsoft-com:office:office" xmlns:r="http://schemas.openxmlformats.org/officeDocument/2006/relationships" xmlns:v="urn:schemas-microsoft-com:vml" xmlns:w10="urn:schemas-microsoft-com:office:word" xmlns:w14="http://schemas.microsoft.com/office/word/2010/wordml" xmlns:w="http://schemas.openxmlformats.org/wordprocessingml/2006/main" xmlns:wne="http://schemas.microsoft.com/office/word/2006/wordml" xmlns:wp14="http://schemas.microsoft.com/office/word/2010/wordprocessingDrawing" xmlns:wp="http://schemas.openxmlformats.org/drawingml/2006/wordprocessingDrawing" xmlns:wpc="http://schemas.microsoft.com/office/word/2010/wordprocessingCanvas" xmlns:wpg="http://schemas.microsoft.com/office/word/2010/wordprocessingGroup" xmlns:wpi="http://schemas.microsoft.com/office/word/2010/wordprocessingInk" xmlns:wps="http://schemas.microsoft.com/office/word/2010/wordprocessingShape" mc:Ignorable="w14 wp14">
-  <w:p>
-    <w:pPr>
-      <w:pStyle w:val="Header"/>
-      <w:jc w:val="right"/>
-    </w:pPr>
-    <w:fldSimple w:instr="PAGE"/>
-  </w:p>
-</w:hdr>
 </file>
 
 <file path=word/numbering.xml><?xml version="1.0" encoding="utf-8"?>
@@ -2164,12 +2371,11 @@
     <w:name w:val="Normal"/>
     <w:qFormat/>
     <w:pPr>
-      <w:spacing w:after="0" w:line="480" w:lineRule="auto"/>
-      <w:ind w:firstLine="720"/>
+      <w:spacing w:after="60" w:line="360" w:lineRule="auto"/>
     </w:pPr>
     <w:rPr>
       <w:rFonts w:ascii="Times New Roman" w:hAnsi="Times New Roman"/>
-      <w:color w:val="000000"/>
+      <w:color w:val="191E28"/>
       <w:sz w:val="24"/>
     </w:rPr>
   </w:style>
@@ -2179,27 +2385,35 @@
     <w:link w:val="BodyTextChar"/>
     <w:qFormat/>
     <w:pPr>
-      <w:spacing w:after="180" w:before="180"/>
+      <w:spacing w:after="60" w:before="180" w:line="360" w:lineRule="auto"/>
     </w:pPr>
+    <w:rPr>
+      <w:rFonts w:ascii="Times New Roman" w:hAnsi="Times New Roman"/>
+      <w:color w:val="191E28"/>
+      <w:sz w:val="24"/>
+    </w:rPr>
   </w:style>
   <w:style w:customStyle="1" w:styleId="FirstParagraph" w:type="paragraph">
     <w:name w:val="First Paragraph"/>
     <w:basedOn w:val="BodyText"/>
     <w:next w:val="BodyText"/>
     <w:qFormat/>
+    <w:pPr>
+      <w:spacing w:after="60" w:line="360" w:lineRule="auto"/>
+    </w:pPr>
+    <w:rPr>
+      <w:rFonts w:ascii="Times New Roman" w:hAnsi="Times New Roman"/>
+      <w:color w:val="191E28"/>
+      <w:sz w:val="24"/>
+    </w:rPr>
   </w:style>
   <w:style w:customStyle="1" w:styleId="Compact" w:type="paragraph">
     <w:name w:val="Compact"/>
     <w:basedOn w:val="BodyText"/>
     <w:qFormat/>
     <w:pPr>
-      <w:spacing w:after="0" w:before="36" w:line="240" w:lineRule="auto"/>
-      <w:ind w:firstLine="0"/>
+      <w:spacing w:after="36" w:before="36"/>
     </w:pPr>
-    <w:rPr>
-      <w:rFonts w:ascii="Times New Roman" w:hAnsi="Times New Roman"/>
-      <w:sz w:val="20"/>
-    </w:rPr>
   </w:style>
   <w:style w:styleId="Title" w:type="paragraph">
     <w:name w:val="Title"/>
@@ -2209,16 +2423,15 @@
     <w:pPr>
       <w:keepNext/>
       <w:keepLines/>
-      <w:spacing w:after="40" w:before="120" w:line="480" w:lineRule="auto"/>
-      <w:ind w:firstLine="0"/>
+      <w:spacing w:after="240" w:before="480"/>
       <w:jc w:val="center"/>
     </w:pPr>
     <w:rPr>
-      <w:rFonts w:ascii="Times New Roman" w:asciiTheme="majorHAnsi" w:cstheme="majorBidi" w:eastAsiaTheme="majorEastAsia" w:hAnsi="Times New Roman" w:hAnsiTheme="majorHAnsi"/>
+      <w:rFonts w:asciiTheme="majorHAnsi" w:cstheme="majorBidi" w:eastAsiaTheme="majorEastAsia" w:hAnsiTheme="majorHAnsi"/>
       <w:b/>
       <w:bCs/>
-      <w:color w:val="000000"/>
-      <w:sz w:val="24"/>
+      <w:color w:themeColor="accent1" w:themeShade="B5" w:val="345A8A"/>
+      <w:sz w:val="36"/>
       <w:szCs w:val="36"/>
     </w:rPr>
   </w:style>
@@ -2315,7 +2528,7 @@
       <w:rFonts w:asciiTheme="majorHAnsi" w:cstheme="majorBidi" w:eastAsiaTheme="majorEastAsia" w:hAnsiTheme="majorHAnsi"/>
       <w:b/>
       <w:bCs/>
-      <w:color w:val="000000"/>
+      <w:color w:themeColor="accent1" w:val="4F81BD"/>
       <w:sz w:val="32"/>
       <w:szCs w:val="32"/>
     </w:rPr>
@@ -2337,7 +2550,7 @@
       <w:rFonts w:asciiTheme="majorHAnsi" w:cstheme="majorBidi" w:eastAsiaTheme="majorEastAsia" w:hAnsiTheme="majorHAnsi"/>
       <w:b/>
       <w:bCs/>
-      <w:color w:val="000000"/>
+      <w:color w:themeColor="accent1" w:val="4F81BD"/>
       <w:sz w:val="28"/>
       <w:szCs w:val="28"/>
     </w:rPr>
@@ -2359,7 +2572,7 @@
       <w:rFonts w:asciiTheme="majorHAnsi" w:cstheme="majorBidi" w:eastAsiaTheme="majorEastAsia" w:hAnsiTheme="majorHAnsi"/>
       <w:b/>
       <w:bCs/>
-      <w:color w:val="000000"/>
+      <w:color w:themeColor="accent1" w:val="4F81BD"/>
       <w:sz w:val="24"/>
       <w:szCs w:val="24"/>
     </w:rPr>
@@ -2532,7 +2745,7 @@
     <w:qFormat/>
     <w:rPr>
       <w:rFonts w:ascii="Times New Roman" w:hAnsi="Times New Roman"/>
-      <w:sz w:val="18"/>
+      <w:sz w:val="20"/>
     </w:rPr>
     <w:tblPr>
       <w:tblInd w:type="dxa" w:w="0"/>

</xml_diff>